<commit_message>
docs: update checkpoint and bussiness process
</commit_message>
<xml_diff>
--- a/SWP391/bussiness_process_overview.docx
+++ b/SWP391/bussiness_process_overview.docx
@@ -281,7 +281,7 @@
           <w:rFonts w:ascii="Cambria" w:hAnsi="Cambria"/>
         </w:rPr>
         <w:pict w14:anchorId="6E1F5D67">
-          <v:rect id="_x0000_i1133" style="width:0;height:1.5pt" o:hralign="center" o:hrstd="t" o:hr="t" fillcolor="#a0a0a0" stroked="f"/>
+          <v:rect id="_x0000_i1025" style="width:0;height:1.5pt" o:hralign="center" o:hrstd="t" o:hr="t" fillcolor="#a0a0a0" stroked="f"/>
         </w:pict>
       </w:r>
     </w:p>
@@ -682,7 +682,7 @@
           <w:rFonts w:ascii="Cambria" w:hAnsi="Cambria"/>
         </w:rPr>
         <w:pict w14:anchorId="4C1FB21B">
-          <v:rect id="_x0000_i1079" style="width:0;height:1.5pt" o:hralign="center" o:hrstd="t" o:hr="t" fillcolor="#a0a0a0" stroked="f"/>
+          <v:rect id="_x0000_i1026" style="width:0;height:1.5pt" o:hralign="center" o:hrstd="t" o:hr="t" fillcolor="#a0a0a0" stroked="f"/>
         </w:pict>
       </w:r>
     </w:p>
@@ -882,7 +882,7 @@
           <w:rFonts w:ascii="Cambria" w:hAnsi="Cambria"/>
         </w:rPr>
         <w:pict w14:anchorId="77009CFB">
-          <v:rect id="_x0000_i1080" style="width:0;height:1.5pt" o:hralign="center" o:hrstd="t" o:hr="t" fillcolor="#a0a0a0" stroked="f"/>
+          <v:rect id="_x0000_i1027" style="width:0;height:1.5pt" o:hralign="center" o:hrstd="t" o:hr="t" fillcolor="#a0a0a0" stroked="f"/>
         </w:pict>
       </w:r>
     </w:p>
@@ -1224,7 +1224,7 @@
           <w:rFonts w:ascii="Cambria" w:hAnsi="Cambria"/>
         </w:rPr>
         <w:pict w14:anchorId="6D934DF4">
-          <v:rect id="_x0000_i1081" style="width:0;height:1.5pt" o:hralign="center" o:hrstd="t" o:hr="t" fillcolor="#a0a0a0" stroked="f"/>
+          <v:rect id="_x0000_i1028" style="width:0;height:1.5pt" o:hralign="center" o:hrstd="t" o:hr="t" fillcolor="#a0a0a0" stroked="f"/>
         </w:pict>
       </w:r>
     </w:p>
@@ -1484,7 +1484,7 @@
           <w:rFonts w:ascii="Cambria" w:hAnsi="Cambria"/>
         </w:rPr>
         <w:pict w14:anchorId="472284BF">
-          <v:rect id="_x0000_i1082" style="width:0;height:1.5pt" o:hralign="center" o:hrstd="t" o:hr="t" fillcolor="#a0a0a0" stroked="f"/>
+          <v:rect id="_x0000_i1029" style="width:0;height:1.5pt" o:hralign="center" o:hrstd="t" o:hr="t" fillcolor="#a0a0a0" stroked="f"/>
         </w:pict>
       </w:r>
     </w:p>
@@ -1738,7 +1738,7 @@
           <w:rFonts w:ascii="Cambria" w:hAnsi="Cambria"/>
         </w:rPr>
         <w:pict w14:anchorId="124B7E03">
-          <v:rect id="_x0000_i1083" style="width:0;height:1.5pt" o:hralign="center" o:hrstd="t" o:hr="t" fillcolor="#a0a0a0" stroked="f"/>
+          <v:rect id="_x0000_i1030" style="width:0;height:1.5pt" o:hralign="center" o:hrstd="t" o:hr="t" fillcolor="#a0a0a0" stroked="f"/>
         </w:pict>
       </w:r>
     </w:p>
@@ -2088,7 +2088,7 @@
           <w:rFonts w:ascii="Cambria" w:hAnsi="Cambria"/>
         </w:rPr>
         <w:pict w14:anchorId="752DFEC5">
-          <v:rect id="_x0000_i1084" style="width:0;height:1.5pt" o:hralign="center" o:hrstd="t" o:hr="t" fillcolor="#a0a0a0" stroked="f"/>
+          <v:rect id="_x0000_i1031" style="width:0;height:1.5pt" o:hralign="center" o:hrstd="t" o:hr="t" fillcolor="#a0a0a0" stroked="f"/>
         </w:pict>
       </w:r>
     </w:p>
@@ -2220,7 +2220,7 @@
           <w:rFonts w:ascii="Cambria" w:hAnsi="Cambria"/>
         </w:rPr>
         <w:pict w14:anchorId="0093C8ED">
-          <v:rect id="_x0000_i1085" style="width:0;height:1.5pt" o:hralign="center" o:hrstd="t" o:hr="t" fillcolor="#a0a0a0" stroked="f"/>
+          <v:rect id="_x0000_i1032" style="width:0;height:1.5pt" o:hralign="center" o:hrstd="t" o:hr="t" fillcolor="#a0a0a0" stroked="f"/>
         </w:pict>
       </w:r>
     </w:p>
@@ -2370,7 +2370,7 @@
           <w:rFonts w:ascii="Cambria" w:hAnsi="Cambria"/>
         </w:rPr>
         <w:pict w14:anchorId="408FDB3A">
-          <v:rect id="_x0000_i1086" style="width:0;height:1.5pt" o:hralign="center" o:hrstd="t" o:hr="t" fillcolor="#a0a0a0" stroked="f"/>
+          <v:rect id="_x0000_i1033" style="width:0;height:1.5pt" o:hralign="center" o:hrstd="t" o:hr="t" fillcolor="#a0a0a0" stroked="f"/>
         </w:pict>
       </w:r>
     </w:p>
@@ -2502,7 +2502,7 @@
           <w:rFonts w:ascii="Cambria" w:hAnsi="Cambria"/>
         </w:rPr>
         <w:pict w14:anchorId="69DA2393">
-          <v:rect id="_x0000_i1087" style="width:0;height:1.5pt" o:hralign="center" o:hrstd="t" o:hr="t" fillcolor="#a0a0a0" stroked="f"/>
+          <v:rect id="_x0000_i1034" style="width:0;height:1.5pt" o:hralign="center" o:hrstd="t" o:hr="t" fillcolor="#a0a0a0" stroked="f"/>
         </w:pict>
       </w:r>
     </w:p>
@@ -2621,7 +2621,7 @@
           <w:rFonts w:ascii="Cambria" w:hAnsi="Cambria"/>
         </w:rPr>
         <w:pict w14:anchorId="3884555D">
-          <v:rect id="_x0000_i1137" style="width:0;height:1.5pt" o:hralign="center" o:hrstd="t" o:hr="t" fillcolor="#a0a0a0" stroked="f"/>
+          <v:rect id="_x0000_i1035" style="width:0;height:1.5pt" o:hralign="center" o:hrstd="t" o:hr="t" fillcolor="#a0a0a0" stroked="f"/>
         </w:pict>
       </w:r>
     </w:p>
@@ -2672,20 +2672,62 @@
         <w:spacing w:after="0"/>
         <w:ind w:left="360"/>
         <w:rPr>
+          <w:rFonts w:ascii="Cambria" w:hAnsi="Cambria"/>
+        </w:rPr>
+      </w:pPr>
+      <w:r>
+        <w:rPr>
           <w:rFonts w:ascii="Cambria" w:hAnsi="Cambria" w:hint="eastAsia"/>
         </w:rPr>
-      </w:pPr>
+        <w:t xml:space="preserve">        </w:t>
+      </w:r>
       <w:r>
         <w:rPr>
           <w:rFonts w:ascii="Cambria" w:hAnsi="Cambria" w:hint="eastAsia"/>
         </w:rPr>
+        <w:t>↓</w:t>
+      </w:r>
+      <w:r>
+        <w:rPr>
+          <w:rFonts w:ascii="Cambria" w:hAnsi="Cambria" w:hint="eastAsia"/>
+        </w:rPr>
+        <w:t xml:space="preserve"> REST API</w:t>
+      </w:r>
+    </w:p>
+    <w:p>
+      <w:pPr>
+        <w:spacing w:after="0"/>
+        <w:ind w:left="360"/>
+        <w:rPr>
+          <w:rFonts w:ascii="Cambria" w:hAnsi="Cambria"/>
+        </w:rPr>
+      </w:pPr>
+      <w:r>
+        <w:rPr>
+          <w:rFonts w:ascii="Cambria" w:hAnsi="Cambria"/>
+        </w:rPr>
+        <w:t xml:space="preserve">   Supporting Tool</w:t>
+      </w:r>
+    </w:p>
+    <w:p>
+      <w:pPr>
+        <w:spacing w:after="0"/>
+        <w:ind w:left="360"/>
+        <w:rPr>
+          <w:rFonts w:ascii="Cambria" w:hAnsi="Cambria"/>
+        </w:rPr>
+      </w:pPr>
+      <w:r>
+        <w:rPr>
+          <w:rFonts w:ascii="Cambria" w:hAnsi="Cambria" w:hint="eastAsia"/>
+        </w:rPr>
         <w:t xml:space="preserve">        </w:t>
       </w:r>
       <w:r>
         <w:rPr>
           <w:rFonts w:ascii="Cambria" w:hAnsi="Cambria" w:hint="eastAsia"/>
         </w:rPr>
-        <w:t>↓</w:t>
+        <w:t>↑</w:t>
       </w:r>
       <w:r>
         <w:rPr>
@@ -2706,7 +2748,7 @@
         <w:rPr>
           <w:rFonts w:ascii="Cambria" w:hAnsi="Cambria"/>
         </w:rPr>
-        <w:t xml:space="preserve">   Supporting Tool</w:t>
+        <w:t>GitHub (Commits &amp; Source Code)</w:t>
       </w:r>
     </w:p>
     <w:p>
@@ -2714,49 +2756,9 @@
         <w:spacing w:after="0"/>
         <w:ind w:left="360"/>
         <w:rPr>
-          <w:rFonts w:ascii="Cambria" w:hAnsi="Cambria" w:hint="eastAsia"/>
-        </w:rPr>
-      </w:pPr>
-      <w:r>
-        <w:rPr>
-          <w:rFonts w:ascii="Cambria" w:hAnsi="Cambria" w:hint="eastAsia"/>
-        </w:rPr>
-        <w:t xml:space="preserve">        </w:t>
-      </w:r>
-      <w:r>
-        <w:rPr>
-          <w:rFonts w:ascii="Cambria" w:hAnsi="Cambria" w:hint="eastAsia"/>
-        </w:rPr>
-        <w:t>↑</w:t>
-      </w:r>
-      <w:r>
-        <w:rPr>
-          <w:rFonts w:ascii="Cambria" w:hAnsi="Cambria" w:hint="eastAsia"/>
-        </w:rPr>
-        <w:t xml:space="preserve"> REST API</w:t>
-      </w:r>
-    </w:p>
-    <w:p>
-      <w:pPr>
-        <w:spacing w:after="0"/>
-        <w:ind w:left="360"/>
-        <w:rPr>
-          <w:rFonts w:ascii="Cambria" w:hAnsi="Cambria"/>
-        </w:rPr>
-      </w:pPr>
-      <w:r>
-        <w:rPr>
-          <w:rFonts w:ascii="Cambria" w:hAnsi="Cambria"/>
-        </w:rPr>
-        <w:t>GitHub (Commits &amp; Source Code)</w:t>
-      </w:r>
-    </w:p>
-    <w:p>
-      <w:pPr>
-        <w:spacing w:after="0"/>
-        <w:ind w:left="360"/>
-        <w:rPr>
-          <w:rFonts w:ascii="Cambria" w:hAnsi="Cambria"/>
+          <w:rFonts w:ascii="Cambria" w:hAnsi="Cambria"/>
+          <w:b/>
+          <w:bCs/>
         </w:rPr>
       </w:pPr>
       <w:r>
@@ -2801,6 +2803,123 @@
 <file path=word/numbering.xml><?xml version="1.0" encoding="utf-8"?>
 <w:numbering xmlns:wpc="http://schemas.microsoft.com/office/word/2010/wordprocessingCanvas" xmlns:cx="http://schemas.microsoft.com/office/drawing/2014/chartex" xmlns:cx1="http://schemas.microsoft.com/office/drawing/2015/9/8/chartex" xmlns:cx2="http://schemas.microsoft.com/office/drawing/2015/10/21/chartex" xmlns:cx3="http://schemas.microsoft.com/office/drawing/2016/5/9/chartex" xmlns:cx4="http://schemas.microsoft.com/office/drawing/2016/5/10/chartex" xmlns:cx5="http://schemas.microsoft.com/office/drawing/2016/5/11/chartex" xmlns:cx6="http://schemas.microsoft.com/office/drawing/2016/5/12/chartex" xmlns:cx7="http://schemas.microsoft.com/office/drawing/2016/5/13/chartex" xmlns:cx8="http://schemas.microsoft.com/office/drawing/2016/5/14/chartex" xmlns:mc="http://schemas.openxmlformats.org/markup-compatibility/2006" xmlns:aink="http://schemas.microsoft.com/office/drawing/2016/ink" xmlns:am3d="http://schemas.microsoft.com/office/drawing/2017/model3d" xmlns:o="urn:schemas-microsoft-com:office:office" xmlns:oel="http://schemas.microsoft.com/office/2019/extlst" xmlns:r="http://schemas.openxmlformats.org/officeDocument/2006/relationships" xmlns:m="http://schemas.openxmlformats.org/officeDocument/2006/math" xmlns:v="urn:schemas-microsoft-com:vml" xmlns:wp14="http://schemas.microsoft.com/office/word/2010/wordprocessingDrawing" xmlns:wp="http://schemas.openxmlformats.org/drawingml/2006/wordprocessingDrawing" xmlns:w10="urn:schemas-microsoft-com:office:word" xmlns:w="http://schemas.openxmlformats.org/wordprocessingml/2006/main" xmlns:w14="http://schemas.microsoft.com/office/word/2010/wordml" xmlns:w15="http://schemas.microsoft.com/office/word/2012/wordml" xmlns:w16cex="http://schemas.microsoft.com/office/word/2018/wordml/cex" xmlns:w16cid="http://schemas.microsoft.com/office/word/2016/wordml/cid" xmlns:w16="http://schemas.microsoft.com/office/word/2018/wordml" xmlns:w16du="http://schemas.microsoft.com/office/word/2023/wordml/word16du" xmlns:w16sdtdh="http://schemas.microsoft.com/office/word/2020/wordml/sdtdatahash" xmlns:w16sdtfl="http://schemas.microsoft.com/office/word/2024/wordml/sdtformatlock" xmlns:w16se="http://schemas.microsoft.com/office/word/2015/wordml/symex" xmlns:wpg="http://schemas.microsoft.com/office/word/2010/wordprocessingGroup" xmlns:wpi="http://schemas.microsoft.com/office/word/2010/wordprocessingInk" xmlns:wne="http://schemas.microsoft.com/office/word/2006/wordml" xmlns:wps="http://schemas.microsoft.com/office/word/2010/wordprocessingShape" mc:Ignorable="w14 w15 w16se w16cid w16 w16cex w16sdtdh w16sdtfl w16du wp14">
   <w:abstractNum w:abstractNumId="0" w15:restartNumberingAfterBreak="0">
+    <w:nsid w:val="06163C50"/>
+    <w:multiLevelType w:val="multilevel"/>
+    <w:tmpl w:val="0492CA62"/>
+    <w:lvl w:ilvl="0">
+      <w:start w:val="1"/>
+      <w:numFmt w:val="decimal"/>
+      <w:lvlText w:val="%1."/>
+      <w:lvlJc w:val="left"/>
+      <w:pPr>
+        <w:tabs>
+          <w:tab w:val="num" w:pos="720"/>
+        </w:tabs>
+        <w:ind w:left="720" w:hanging="360"/>
+      </w:pPr>
+    </w:lvl>
+    <w:lvl w:ilvl="1">
+      <w:start w:val="1"/>
+      <w:numFmt w:val="bullet"/>
+      <w:lvlText w:val="o"/>
+      <w:lvlJc w:val="left"/>
+      <w:pPr>
+        <w:tabs>
+          <w:tab w:val="num" w:pos="1440"/>
+        </w:tabs>
+        <w:ind w:left="1440" w:hanging="360"/>
+      </w:pPr>
+      <w:rPr>
+        <w:rFonts w:ascii="Courier New" w:hAnsi="Courier New" w:hint="default"/>
+        <w:sz w:val="20"/>
+      </w:rPr>
+    </w:lvl>
+    <w:lvl w:ilvl="2" w:tentative="1">
+      <w:start w:val="1"/>
+      <w:numFmt w:val="decimal"/>
+      <w:lvlText w:val="%3."/>
+      <w:lvlJc w:val="left"/>
+      <w:pPr>
+        <w:tabs>
+          <w:tab w:val="num" w:pos="2160"/>
+        </w:tabs>
+        <w:ind w:left="2160" w:hanging="360"/>
+      </w:pPr>
+    </w:lvl>
+    <w:lvl w:ilvl="3" w:tentative="1">
+      <w:start w:val="1"/>
+      <w:numFmt w:val="decimal"/>
+      <w:lvlText w:val="%4."/>
+      <w:lvlJc w:val="left"/>
+      <w:pPr>
+        <w:tabs>
+          <w:tab w:val="num" w:pos="2880"/>
+        </w:tabs>
+        <w:ind w:left="2880" w:hanging="360"/>
+      </w:pPr>
+    </w:lvl>
+    <w:lvl w:ilvl="4" w:tentative="1">
+      <w:start w:val="1"/>
+      <w:numFmt w:val="decimal"/>
+      <w:lvlText w:val="%5."/>
+      <w:lvlJc w:val="left"/>
+      <w:pPr>
+        <w:tabs>
+          <w:tab w:val="num" w:pos="3600"/>
+        </w:tabs>
+        <w:ind w:left="3600" w:hanging="360"/>
+      </w:pPr>
+    </w:lvl>
+    <w:lvl w:ilvl="5" w:tentative="1">
+      <w:start w:val="1"/>
+      <w:numFmt w:val="decimal"/>
+      <w:lvlText w:val="%6."/>
+      <w:lvlJc w:val="left"/>
+      <w:pPr>
+        <w:tabs>
+          <w:tab w:val="num" w:pos="4320"/>
+        </w:tabs>
+        <w:ind w:left="4320" w:hanging="360"/>
+      </w:pPr>
+    </w:lvl>
+    <w:lvl w:ilvl="6" w:tentative="1">
+      <w:start w:val="1"/>
+      <w:numFmt w:val="decimal"/>
+      <w:lvlText w:val="%7."/>
+      <w:lvlJc w:val="left"/>
+      <w:pPr>
+        <w:tabs>
+          <w:tab w:val="num" w:pos="5040"/>
+        </w:tabs>
+        <w:ind w:left="5040" w:hanging="360"/>
+      </w:pPr>
+    </w:lvl>
+    <w:lvl w:ilvl="7" w:tentative="1">
+      <w:start w:val="1"/>
+      <w:numFmt w:val="decimal"/>
+      <w:lvlText w:val="%8."/>
+      <w:lvlJc w:val="left"/>
+      <w:pPr>
+        <w:tabs>
+          <w:tab w:val="num" w:pos="5760"/>
+        </w:tabs>
+        <w:ind w:left="5760" w:hanging="360"/>
+      </w:pPr>
+    </w:lvl>
+    <w:lvl w:ilvl="8" w:tentative="1">
+      <w:start w:val="1"/>
+      <w:numFmt w:val="decimal"/>
+      <w:lvlText w:val="%9."/>
+      <w:lvlJc w:val="left"/>
+      <w:pPr>
+        <w:tabs>
+          <w:tab w:val="num" w:pos="6480"/>
+        </w:tabs>
+        <w:ind w:left="6480" w:hanging="360"/>
+      </w:pPr>
+    </w:lvl>
+  </w:abstractNum>
+  <w:abstractNum w:abstractNumId="1" w15:restartNumberingAfterBreak="0">
     <w:nsid w:val="138D4BAA"/>
     <w:multiLevelType w:val="multilevel"/>
     <w:tmpl w:val="F280CC28"/>
@@ -2949,7 +3068,7 @@
       </w:rPr>
     </w:lvl>
   </w:abstractNum>
-  <w:abstractNum w:abstractNumId="1" w15:restartNumberingAfterBreak="0">
+  <w:abstractNum w:abstractNumId="2" w15:restartNumberingAfterBreak="0">
     <w:nsid w:val="2E716592"/>
     <w:multiLevelType w:val="multilevel"/>
     <w:tmpl w:val="AD66B790"/>
@@ -3098,7 +3217,7 @@
       </w:rPr>
     </w:lvl>
   </w:abstractNum>
-  <w:abstractNum w:abstractNumId="2" w15:restartNumberingAfterBreak="0">
+  <w:abstractNum w:abstractNumId="3" w15:restartNumberingAfterBreak="0">
     <w:nsid w:val="31E00F28"/>
     <w:multiLevelType w:val="multilevel"/>
     <w:tmpl w:val="5324F98A"/>
@@ -3247,7 +3366,156 @@
       </w:rPr>
     </w:lvl>
   </w:abstractNum>
-  <w:abstractNum w:abstractNumId="3" w15:restartNumberingAfterBreak="0">
+  <w:abstractNum w:abstractNumId="4" w15:restartNumberingAfterBreak="0">
+    <w:nsid w:val="3C3A2CE3"/>
+    <w:multiLevelType w:val="multilevel"/>
+    <w:tmpl w:val="81E6E746"/>
+    <w:lvl w:ilvl="0">
+      <w:start w:val="1"/>
+      <w:numFmt w:val="bullet"/>
+      <w:lvlText w:val=""/>
+      <w:lvlJc w:val="left"/>
+      <w:pPr>
+        <w:tabs>
+          <w:tab w:val="num" w:pos="720"/>
+        </w:tabs>
+        <w:ind w:left="720" w:hanging="360"/>
+      </w:pPr>
+      <w:rPr>
+        <w:rFonts w:ascii="Symbol" w:hAnsi="Symbol" w:hint="default"/>
+        <w:sz w:val="20"/>
+      </w:rPr>
+    </w:lvl>
+    <w:lvl w:ilvl="1" w:tentative="1">
+      <w:start w:val="1"/>
+      <w:numFmt w:val="bullet"/>
+      <w:lvlText w:val="o"/>
+      <w:lvlJc w:val="left"/>
+      <w:pPr>
+        <w:tabs>
+          <w:tab w:val="num" w:pos="1440"/>
+        </w:tabs>
+        <w:ind w:left="1440" w:hanging="360"/>
+      </w:pPr>
+      <w:rPr>
+        <w:rFonts w:ascii="Courier New" w:hAnsi="Courier New" w:hint="default"/>
+        <w:sz w:val="20"/>
+      </w:rPr>
+    </w:lvl>
+    <w:lvl w:ilvl="2" w:tentative="1">
+      <w:start w:val="1"/>
+      <w:numFmt w:val="bullet"/>
+      <w:lvlText w:val=""/>
+      <w:lvlJc w:val="left"/>
+      <w:pPr>
+        <w:tabs>
+          <w:tab w:val="num" w:pos="2160"/>
+        </w:tabs>
+        <w:ind w:left="2160" w:hanging="360"/>
+      </w:pPr>
+      <w:rPr>
+        <w:rFonts w:ascii="Wingdings" w:hAnsi="Wingdings" w:hint="default"/>
+        <w:sz w:val="20"/>
+      </w:rPr>
+    </w:lvl>
+    <w:lvl w:ilvl="3" w:tentative="1">
+      <w:start w:val="1"/>
+      <w:numFmt w:val="bullet"/>
+      <w:lvlText w:val=""/>
+      <w:lvlJc w:val="left"/>
+      <w:pPr>
+        <w:tabs>
+          <w:tab w:val="num" w:pos="2880"/>
+        </w:tabs>
+        <w:ind w:left="2880" w:hanging="360"/>
+      </w:pPr>
+      <w:rPr>
+        <w:rFonts w:ascii="Wingdings" w:hAnsi="Wingdings" w:hint="default"/>
+        <w:sz w:val="20"/>
+      </w:rPr>
+    </w:lvl>
+    <w:lvl w:ilvl="4" w:tentative="1">
+      <w:start w:val="1"/>
+      <w:numFmt w:val="bullet"/>
+      <w:lvlText w:val=""/>
+      <w:lvlJc w:val="left"/>
+      <w:pPr>
+        <w:tabs>
+          <w:tab w:val="num" w:pos="3600"/>
+        </w:tabs>
+        <w:ind w:left="3600" w:hanging="360"/>
+      </w:pPr>
+      <w:rPr>
+        <w:rFonts w:ascii="Wingdings" w:hAnsi="Wingdings" w:hint="default"/>
+        <w:sz w:val="20"/>
+      </w:rPr>
+    </w:lvl>
+    <w:lvl w:ilvl="5" w:tentative="1">
+      <w:start w:val="1"/>
+      <w:numFmt w:val="bullet"/>
+      <w:lvlText w:val=""/>
+      <w:lvlJc w:val="left"/>
+      <w:pPr>
+        <w:tabs>
+          <w:tab w:val="num" w:pos="4320"/>
+        </w:tabs>
+        <w:ind w:left="4320" w:hanging="360"/>
+      </w:pPr>
+      <w:rPr>
+        <w:rFonts w:ascii="Wingdings" w:hAnsi="Wingdings" w:hint="default"/>
+        <w:sz w:val="20"/>
+      </w:rPr>
+    </w:lvl>
+    <w:lvl w:ilvl="6" w:tentative="1">
+      <w:start w:val="1"/>
+      <w:numFmt w:val="bullet"/>
+      <w:lvlText w:val=""/>
+      <w:lvlJc w:val="left"/>
+      <w:pPr>
+        <w:tabs>
+          <w:tab w:val="num" w:pos="5040"/>
+        </w:tabs>
+        <w:ind w:left="5040" w:hanging="360"/>
+      </w:pPr>
+      <w:rPr>
+        <w:rFonts w:ascii="Wingdings" w:hAnsi="Wingdings" w:hint="default"/>
+        <w:sz w:val="20"/>
+      </w:rPr>
+    </w:lvl>
+    <w:lvl w:ilvl="7" w:tentative="1">
+      <w:start w:val="1"/>
+      <w:numFmt w:val="bullet"/>
+      <w:lvlText w:val=""/>
+      <w:lvlJc w:val="left"/>
+      <w:pPr>
+        <w:tabs>
+          <w:tab w:val="num" w:pos="5760"/>
+        </w:tabs>
+        <w:ind w:left="5760" w:hanging="360"/>
+      </w:pPr>
+      <w:rPr>
+        <w:rFonts w:ascii="Wingdings" w:hAnsi="Wingdings" w:hint="default"/>
+        <w:sz w:val="20"/>
+      </w:rPr>
+    </w:lvl>
+    <w:lvl w:ilvl="8" w:tentative="1">
+      <w:start w:val="1"/>
+      <w:numFmt w:val="bullet"/>
+      <w:lvlText w:val=""/>
+      <w:lvlJc w:val="left"/>
+      <w:pPr>
+        <w:tabs>
+          <w:tab w:val="num" w:pos="6480"/>
+        </w:tabs>
+        <w:ind w:left="6480" w:hanging="360"/>
+      </w:pPr>
+      <w:rPr>
+        <w:rFonts w:ascii="Wingdings" w:hAnsi="Wingdings" w:hint="default"/>
+        <w:sz w:val="20"/>
+      </w:rPr>
+    </w:lvl>
+  </w:abstractNum>
+  <w:abstractNum w:abstractNumId="5" w15:restartNumberingAfterBreak="0">
     <w:nsid w:val="41C5680C"/>
     <w:multiLevelType w:val="multilevel"/>
     <w:tmpl w:val="E2568174"/>
@@ -3396,7 +3664,7 @@
       </w:rPr>
     </w:lvl>
   </w:abstractNum>
-  <w:abstractNum w:abstractNumId="4" w15:restartNumberingAfterBreak="0">
+  <w:abstractNum w:abstractNumId="6" w15:restartNumberingAfterBreak="0">
     <w:nsid w:val="5ABF1994"/>
     <w:multiLevelType w:val="multilevel"/>
     <w:tmpl w:val="74C05F28"/>
@@ -3513,7 +3781,7 @@
       </w:pPr>
     </w:lvl>
   </w:abstractNum>
-  <w:abstractNum w:abstractNumId="5" w15:restartNumberingAfterBreak="0">
+  <w:abstractNum w:abstractNumId="7" w15:restartNumberingAfterBreak="0">
     <w:nsid w:val="613E6470"/>
     <w:multiLevelType w:val="multilevel"/>
     <w:tmpl w:val="BA86365A"/>
@@ -3662,7 +3930,7 @@
       </w:rPr>
     </w:lvl>
   </w:abstractNum>
-  <w:abstractNum w:abstractNumId="6" w15:restartNumberingAfterBreak="0">
+  <w:abstractNum w:abstractNumId="8" w15:restartNumberingAfterBreak="0">
     <w:nsid w:val="6C9C59F4"/>
     <w:multiLevelType w:val="multilevel"/>
     <w:tmpl w:val="8376E888"/>
@@ -3811,7 +4079,7 @@
       </w:rPr>
     </w:lvl>
   </w:abstractNum>
-  <w:abstractNum w:abstractNumId="7" w15:restartNumberingAfterBreak="0">
+  <w:abstractNum w:abstractNumId="9" w15:restartNumberingAfterBreak="0">
     <w:nsid w:val="6DD3173D"/>
     <w:multiLevelType w:val="multilevel"/>
     <w:tmpl w:val="42D2048E"/>
@@ -3960,7 +4228,7 @@
       </w:rPr>
     </w:lvl>
   </w:abstractNum>
-  <w:abstractNum w:abstractNumId="8" w15:restartNumberingAfterBreak="0">
+  <w:abstractNum w:abstractNumId="10" w15:restartNumberingAfterBreak="0">
     <w:nsid w:val="6F707631"/>
     <w:multiLevelType w:val="multilevel"/>
     <w:tmpl w:val="05E09BAE"/>
@@ -4077,7 +4345,7 @@
       </w:pPr>
     </w:lvl>
   </w:abstractNum>
-  <w:abstractNum w:abstractNumId="9" w15:restartNumberingAfterBreak="0">
+  <w:abstractNum w:abstractNumId="11" w15:restartNumberingAfterBreak="0">
     <w:nsid w:val="723D51CD"/>
     <w:multiLevelType w:val="multilevel"/>
     <w:tmpl w:val="D2CA3540"/>
@@ -4226,7 +4494,7 @@
       </w:rPr>
     </w:lvl>
   </w:abstractNum>
-  <w:abstractNum w:abstractNumId="10" w15:restartNumberingAfterBreak="0">
+  <w:abstractNum w:abstractNumId="12" w15:restartNumberingAfterBreak="0">
     <w:nsid w:val="79DC528A"/>
     <w:multiLevelType w:val="multilevel"/>
     <w:tmpl w:val="74C05F28"/>
@@ -4344,37 +4612,43 @@
     </w:lvl>
   </w:abstractNum>
   <w:num w:numId="1" w16cid:durableId="1039358153">
+    <w:abstractNumId w:val="7"/>
+  </w:num>
+  <w:num w:numId="2" w16cid:durableId="221140419">
+    <w:abstractNumId w:val="9"/>
+  </w:num>
+  <w:num w:numId="3" w16cid:durableId="1972057914">
+    <w:abstractNumId w:val="10"/>
+  </w:num>
+  <w:num w:numId="4" w16cid:durableId="917059400">
+    <w:abstractNumId w:val="8"/>
+  </w:num>
+  <w:num w:numId="5" w16cid:durableId="215238475">
+    <w:abstractNumId w:val="12"/>
+  </w:num>
+  <w:num w:numId="6" w16cid:durableId="1434352551">
     <w:abstractNumId w:val="5"/>
   </w:num>
-  <w:num w:numId="2" w16cid:durableId="221140419">
-    <w:abstractNumId w:val="7"/>
+  <w:num w:numId="7" w16cid:durableId="770122127">
+    <w:abstractNumId w:val="11"/>
   </w:num>
-  <w:num w:numId="3" w16cid:durableId="1972057914">
-    <w:abstractNumId w:val="8"/>
+  <w:num w:numId="8" w16cid:durableId="1396051302">
+    <w:abstractNumId w:val="3"/>
   </w:num>
-  <w:num w:numId="4" w16cid:durableId="917059400">
+  <w:num w:numId="9" w16cid:durableId="1251233740">
+    <w:abstractNumId w:val="2"/>
+  </w:num>
+  <w:num w:numId="10" w16cid:durableId="1479688374">
+    <w:abstractNumId w:val="1"/>
+  </w:num>
+  <w:num w:numId="11" w16cid:durableId="1952518156">
     <w:abstractNumId w:val="6"/>
   </w:num>
-  <w:num w:numId="5" w16cid:durableId="215238475">
-    <w:abstractNumId w:val="10"/>
+  <w:num w:numId="12" w16cid:durableId="1935548676">
+    <w:abstractNumId w:val="4"/>
   </w:num>
-  <w:num w:numId="6" w16cid:durableId="1434352551">
-    <w:abstractNumId w:val="3"/>
-  </w:num>
-  <w:num w:numId="7" w16cid:durableId="770122127">
-    <w:abstractNumId w:val="9"/>
-  </w:num>
-  <w:num w:numId="8" w16cid:durableId="1396051302">
-    <w:abstractNumId w:val="2"/>
-  </w:num>
-  <w:num w:numId="9" w16cid:durableId="1251233740">
-    <w:abstractNumId w:val="1"/>
-  </w:num>
-  <w:num w:numId="10" w16cid:durableId="1479688374">
+  <w:num w:numId="13" w16cid:durableId="1391270785">
     <w:abstractNumId w:val="0"/>
-  </w:num>
-  <w:num w:numId="11" w16cid:durableId="1952518156">
-    <w:abstractNumId w:val="4"/>
   </w:num>
 </w:numbering>
 </file>

</xml_diff>